<commit_message>
docs: ERS v1.2, entregable Diseno completo del sistema y metodologia Scrum en bitacora
</commit_message>
<xml_diff>
--- a/docs/01-requerimientos/ERS-CINDEC.docx
+++ b/docs/01-requerimientos/ERS-CINDEC.docx
@@ -216,7 +216,7 @@
           <w:sz w:val="22"/>
           <w:szCs w:val="22"/>
         </w:rPr>
-        <w:t xml:space="preserve">León, Guanajuato, septiembre de 2026</w:t>
+        <w:t xml:space="preserve">León, Guanajuato, octubre de 2026</w:t>
       </w:r>
     </w:p>
     <w:p>
@@ -233,7 +233,7 @@
           <w:sz w:val="20"/>
           <w:szCs w:val="20"/>
         </w:rPr>
-        <w:t xml:space="preserve">Versión del documento: 1.1</w:t>
+        <w:t xml:space="preserve">Versión del documento: 1.2</w:t>
       </w:r>
     </w:p>
     <w:p>
@@ -253,13 +253,272 @@
       </w:r>
     </w:p>
     <w:p>
-      <w:r>
-        <w:br w:type="page"/>
-      </w:r>
-    </w:p>
+      <w:pPr>
+        <w:spacing w:before="200" w:after="60"/>
+        <w:jc w:val="center"/>
+      </w:pPr>
+      <w:r>
+        <w:rPr>
+          <w:rFonts w:ascii="Calibri" w:cs="Calibri" w:eastAsia="Calibri" w:hAnsi="Calibri"/>
+          <w:b/>
+          <w:sz w:val="20"/>
+        </w:rPr>
+        <w:t>Historial de versiones</w:t>
+      </w:r>
+    </w:p>
+    <w:tbl>
+      <w:tblPr>
+        <w:tblW w:type="dxa" w:w="9600"/>
+        <w:jc w:val="center"/>
+        <w:tblBorders>
+          <w:top w:val="single" w:color="auto" w:sz="4"/>
+          <w:left w:val="single" w:color="auto" w:sz="4"/>
+          <w:bottom w:val="single" w:color="auto" w:sz="4"/>
+          <w:right w:val="single" w:color="auto" w:sz="4"/>
+          <w:insideH w:val="single" w:color="auto" w:sz="4"/>
+          <w:insideV w:val="single" w:color="auto" w:sz="4"/>
+        </w:tblBorders>
+      </w:tblPr>
+      <w:tblGrid>
+        <w:gridCol w:w="1100"/>
+        <w:gridCol w:w="2000"/>
+        <w:gridCol w:w="6500"/>
+      </w:tblGrid>
+      <w:tr>
+        <w:tc>
+          <w:tcPr>
+            <w:tcW w:type="dxa" w:w="1100"/>
+            <w:shd w:val="clear" w:color="auto" w:fill="D9E2F3"/>
+          </w:tcPr>
+          <w:p>
+            <w:pPr>
+              <w:spacing w:before="40" w:after="40"/>
+            </w:pPr>
+            <w:r>
+              <w:rPr>
+                <w:rFonts w:ascii="Calibri" w:cs="Calibri" w:eastAsia="Calibri" w:hAnsi="Calibri"/>
+                <w:b/>
+                <w:sz w:val="18"/>
+                <w:szCs w:val="18"/>
+              </w:rPr>
+              <w:t xml:space="preserve">Versión</w:t>
+            </w:r>
+          </w:p>
+        </w:tc>
+        <w:tc>
+          <w:tcPr>
+            <w:tcW w:type="dxa" w:w="2000"/>
+            <w:shd w:val="clear" w:color="auto" w:fill="D9E2F3"/>
+          </w:tcPr>
+          <w:p>
+            <w:pPr>
+              <w:spacing w:before="40" w:after="40"/>
+            </w:pPr>
+            <w:r>
+              <w:rPr>
+                <w:rFonts w:ascii="Calibri" w:cs="Calibri" w:eastAsia="Calibri" w:hAnsi="Calibri"/>
+                <w:b/>
+                <w:sz w:val="18"/>
+                <w:szCs w:val="18"/>
+              </w:rPr>
+              <w:t xml:space="preserve">Fecha</w:t>
+            </w:r>
+          </w:p>
+        </w:tc>
+        <w:tc>
+          <w:tcPr>
+            <w:tcW w:type="dxa" w:w="6500"/>
+            <w:shd w:val="clear" w:color="auto" w:fill="D9E2F3"/>
+          </w:tcPr>
+          <w:p>
+            <w:pPr>
+              <w:spacing w:before="40" w:after="40"/>
+            </w:pPr>
+            <w:r>
+              <w:rPr>
+                <w:rFonts w:ascii="Calibri" w:cs="Calibri" w:eastAsia="Calibri" w:hAnsi="Calibri"/>
+                <w:b/>
+                <w:sz w:val="18"/>
+                <w:szCs w:val="18"/>
+              </w:rPr>
+              <w:t xml:space="preserve">Cambios</w:t>
+            </w:r>
+          </w:p>
+        </w:tc>
+      </w:tr>
+      <w:tr>
+        <w:tc>
+          <w:tcPr>
+            <w:tcW w:type="dxa" w:w="1100"/>
+          </w:tcPr>
+          <w:p>
+            <w:pPr>
+              <w:spacing w:before="40" w:after="40"/>
+            </w:pPr>
+            <w:r>
+              <w:rPr>
+                <w:rFonts w:ascii="Calibri" w:cs="Calibri" w:eastAsia="Calibri" w:hAnsi="Calibri"/>
+                <w:sz w:val="18"/>
+                <w:szCs w:val="18"/>
+              </w:rPr>
+              <w:t xml:space="preserve">1.0</w:t>
+            </w:r>
+          </w:p>
+        </w:tc>
+        <w:tc>
+          <w:tcPr>
+            <w:tcW w:type="dxa" w:w="2000"/>
+          </w:tcPr>
+          <w:p>
+            <w:pPr>
+              <w:spacing w:before="40" w:after="40"/>
+            </w:pPr>
+            <w:r>
+              <w:rPr>
+                <w:rFonts w:ascii="Calibri" w:cs="Calibri" w:eastAsia="Calibri" w:hAnsi="Calibri"/>
+                <w:sz w:val="18"/>
+                <w:szCs w:val="18"/>
+              </w:rPr>
+              <w:t xml:space="preserve">Septiembre de 2026</w:t>
+            </w:r>
+          </w:p>
+        </w:tc>
+        <w:tc>
+          <w:tcPr>
+            <w:tcW w:type="dxa" w:w="6500"/>
+          </w:tcPr>
+          <w:p>
+            <w:pPr>
+              <w:spacing w:before="40" w:after="40"/>
+            </w:pPr>
+            <w:r>
+              <w:rPr>
+                <w:rFonts w:ascii="Calibri" w:cs="Calibri" w:eastAsia="Calibri" w:hAnsi="Calibri"/>
+                <w:sz w:val="18"/>
+                <w:szCs w:val="18"/>
+              </w:rPr>
+              <w:t xml:space="preserve">Versión inicial, elaborada a partir del levantamiento de requerimientos con CINDEC.</w:t>
+            </w:r>
+          </w:p>
+        </w:tc>
+      </w:tr>
+      <w:tr>
+        <w:tc>
+          <w:tcPr>
+            <w:tcW w:type="dxa" w:w="1100"/>
+          </w:tcPr>
+          <w:p>
+            <w:pPr>
+              <w:spacing w:before="40" w:after="40"/>
+            </w:pPr>
+            <w:r>
+              <w:rPr>
+                <w:rFonts w:ascii="Calibri" w:cs="Calibri" w:eastAsia="Calibri" w:hAnsi="Calibri"/>
+                <w:sz w:val="18"/>
+                <w:szCs w:val="18"/>
+              </w:rPr>
+              <w:t xml:space="preserve">1.1</w:t>
+            </w:r>
+          </w:p>
+        </w:tc>
+        <w:tc>
+          <w:tcPr>
+            <w:tcW w:type="dxa" w:w="2000"/>
+          </w:tcPr>
+          <w:p>
+            <w:pPr>
+              <w:spacing w:before="40" w:after="40"/>
+            </w:pPr>
+            <w:r>
+              <w:rPr>
+                <w:rFonts w:ascii="Calibri" w:cs="Calibri" w:eastAsia="Calibri" w:hAnsi="Calibri"/>
+                <w:sz w:val="18"/>
+                <w:szCs w:val="18"/>
+              </w:rPr>
+              <w:t xml:space="preserve">1 de octubre de 2026</w:t>
+            </w:r>
+          </w:p>
+        </w:tc>
+        <w:tc>
+          <w:tcPr>
+            <w:tcW w:type="dxa" w:w="6500"/>
+          </w:tcPr>
+          <w:p>
+            <w:pPr>
+              <w:spacing w:before="40" w:after="40"/>
+            </w:pPr>
+            <w:r>
+              <w:rPr>
+                <w:rFonts w:ascii="Calibri" w:cs="Calibri" w:eastAsia="Calibri" w:hAnsi="Calibri"/>
+                <w:sz w:val="18"/>
+                <w:szCs w:val="18"/>
+              </w:rPr>
+              <w:t xml:space="preserve">Se retira por completo el rol "Empresa cliente" de V1 por restricción de tiempo de desarrollo; V1 queda con cinco roles.</w:t>
+            </w:r>
+          </w:p>
+        </w:tc>
+      </w:tr>
+      <w:tr>
+        <w:tc>
+          <w:tcPr>
+            <w:tcW w:type="dxa" w:w="1100"/>
+          </w:tcPr>
+          <w:p>
+            <w:pPr>
+              <w:spacing w:before="40" w:after="40"/>
+            </w:pPr>
+            <w:r>
+              <w:rPr>
+                <w:rFonts w:ascii="Calibri" w:cs="Calibri" w:eastAsia="Calibri" w:hAnsi="Calibri"/>
+                <w:sz w:val="18"/>
+                <w:szCs w:val="18"/>
+              </w:rPr>
+              <w:t xml:space="preserve">1.2</w:t>
+            </w:r>
+          </w:p>
+        </w:tc>
+        <w:tc>
+          <w:tcPr>
+            <w:tcW w:type="dxa" w:w="2000"/>
+          </w:tcPr>
+          <w:p>
+            <w:pPr>
+              <w:spacing w:before="40" w:after="40"/>
+            </w:pPr>
+            <w:r>
+              <w:rPr>
+                <w:rFonts w:ascii="Calibri" w:cs="Calibri" w:eastAsia="Calibri" w:hAnsi="Calibri"/>
+                <w:sz w:val="18"/>
+                <w:szCs w:val="18"/>
+              </w:rPr>
+              <w:t xml:space="preserve">Octubre de 2026</w:t>
+            </w:r>
+          </w:p>
+        </w:tc>
+        <w:tc>
+          <w:tcPr>
+            <w:tcW w:type="dxa" w:w="6500"/>
+          </w:tcPr>
+          <w:p>
+            <w:pPr>
+              <w:spacing w:before="40" w:after="40"/>
+            </w:pPr>
+            <w:r>
+              <w:rPr>
+                <w:rFonts w:ascii="Calibri" w:cs="Calibri" w:eastAsia="Calibri" w:hAnsi="Calibri"/>
+                <w:sz w:val="18"/>
+                <w:szCs w:val="18"/>
+              </w:rPr>
+              <w:t xml:space="preserve">Se adopta el término oficial de CONOCER para el dictamen, "Todavía no competente" (Manual del participante, Red de prestadores de servicios). Sin cambios en los requisitos.</w:t>
+            </w:r>
+          </w:p>
+        </w:tc>
+      </w:tr>
+    </w:tbl>
     <w:p>
       <w:pPr>
         <w:pStyle w:val="Heading1"/>
+        <w:pageBreakBefore/>
         <w:spacing w:after="160" w:before="360"/>
       </w:pPr>
       <w:r>
@@ -1238,7 +1497,7 @@
           <w:sz w:val="22"/>
           <w:szCs w:val="22"/>
         </w:rPr>
-        <w:t xml:space="preserve">Proceso real que el sistema debe soportar (confirmado por CINDEC): la empresa o persona solicita información → se acuerda estándar, participantes, fechas y costo → se registran los participantes → se imparte la capacitación (si aplica) → se evalúa la competencia con los instrumentos/evidencias del estándar CONOCER → se determina competente/no competente → si es competente, CINDEC solicita y paga la certificación a CONOCER, y es CONOCER quien la emite a través de su propio Sistema Integral de Información. Las capacitaciones pueden ser presenciales, en línea o mixtas.</w:t>
+        <w:t xml:space="preserve">Proceso real que el sistema debe soportar (confirmado por CINDEC): la empresa o persona solicita información → se acuerda estándar, participantes, fechas y costo → se registran los participantes → se imparte la capacitación (si aplica) → se evalúa la competencia con los instrumentos/evidencias del estándar CONOCER → se determina competente / todavía no competente → si es competente, CINDEC solicita y paga la certificación a CONOCER, y es CONOCER quien la emite a través de su propio Sistema Integral de Información. Las capacitaciones pueden ser presenciales, en línea o mixtas.</w:t>
       </w:r>
     </w:p>
     <w:p>
@@ -3658,7 +3917,7 @@
           <w:sz w:val="22"/>
           <w:szCs w:val="22"/>
         </w:rPr>
-        <w:t xml:space="preserve">El sistema debe distinguir explícitamente entre: capacitación concluida, evaluación aprobada/no aprobada, persona competente/persona todavía en proceso, y certificación emitida — son conceptos distintos que no deben confundirse.</w:t>
+        <w:t xml:space="preserve">El sistema debe distinguir explícitamente entre: capacitación concluida, evaluación aprobada/no aprobada, persona competente/persona todavía no competente, y certificación emitida — son conceptos distintos que no deben confundirse.</w:t>
       </w:r>
     </w:p>
     <w:p>
@@ -3926,7 +4185,7 @@
           <w:sz w:val="22"/>
           <w:szCs w:val="22"/>
         </w:rPr>
-        <w:t xml:space="preserve">El sistema debe generar reportes operativos derivados de los datos capturados por los demás módulos: participantes registrados por periodo, cursos/grupos activos y concluidos, inscripciones por curso, avance de participantes, asistencia, evaluaciones realizadas (aprobadas/no aprobadas), personas competentes y no competentes, certificaciones solicitadas/en trámite/emitidas, historial de certificaciones, y reportes por instructor y por evaluador.</w:t>
+        <w:t xml:space="preserve">El sistema debe generar reportes operativos derivados de los datos capturados por los demás módulos: participantes registrados por periodo, cursos/grupos activos y concluidos, inscripciones por curso, avance de participantes, asistencia, evaluaciones realizadas (aprobadas/no aprobadas), personas competentes y todavía no competentes, certificaciones solicitadas/en trámite/emitidas, historial de certificaciones, y reportes por instructor y por evaluador.</w:t>
       </w:r>
     </w:p>
     <w:p>
@@ -5775,7 +6034,7 @@
           <w:sz w:val="22"/>
           <w:szCs w:val="22"/>
         </w:rPr>
-        <w:t xml:space="preserve">Un evaluador registra evidencias y el resultado (competente/no competente) de un participante.</w:t>
+        <w:t xml:space="preserve">Un evaluador registra evidencias y el resultado (competente / todavía no competente) de un participante.</w:t>
       </w:r>
     </w:p>
     <w:p>
@@ -5858,7 +6117,7 @@
           <w:sz w:val="20"/>
           <w:szCs w:val="20"/>
         </w:rPr>
-        <w:t xml:space="preserve">Fin del documento. Este ERS refleja el estado “validado con CINDEC” del documento de requerimientos (requerimientos.md) al 1 de octubre de 2026, e incorpora las correcciones de alcance curso/grupo, restricciones vs. RNF medibles, el criterio de evaluación numérico confirmado por Juan Alexis García Gómez, y el retiro completo del rol "Empresa cliente" de V1 por restricción de tiempo de desarrollo. Cualquier cambio posterior a los requerimientos deberá reflejarse primero en requerimientos.md y después propagarse a este documento.</w:t>
+        <w:t xml:space="preserve">Fin del documento. Este ERS refleja el estado “validado con CINDEC” del documento de requerimientos (requerimientos.md) al 1 de octubre de 2026, e incorpora las correcciones de alcance curso/grupo, restricciones vs. RNF medibles, el criterio de evaluación numérico confirmado por Juan Alexis García Gómez, y el retiro completo del rol "Empresa cliente" de V1 por restricción de tiempo de desarrollo. La versión 1.2 adopta el término oficial de CONOCER para el dictamen ("Todavía no competente"), sin cambios en los requisitos. Cualquier cambio posterior a los requerimientos deberá reflejarse primero en requerimientos.md y después propagarse a este documento.</w:t>
       </w:r>
     </w:p>
     <w:sectPr>

</xml_diff>